<commit_message>
feat: add semantic search with embeddings and pgvector
</commit_message>
<xml_diff>
--- a/docs/00_README_состав_архива.docx
+++ b/docs/00_README_состав_архива.docx
@@ -302,17 +302,8 @@
             <w:tcW w:type="dxa" w:w="5128"/>
           </w:tcPr>
           <w:p>
-            <w:pPr>
-              <w:spacing w:after="0"/>
-            </w:pPr>
-            <w:r/>
             <w:r>
-              <w:rPr>
-                <w:rFonts w:ascii="Times New Roman" w:hAnsi="Times New Roman" w:eastAsia="Times New Roman"/>
-                <w:b w:val="0"/>
-                <w:sz w:val="16"/>
-              </w:rPr>
-              <w:t>Фактическая архитектура: React/Vite, Vercel, Supabase, RLS, RPC и /api/analyze-book.</w:t>
+              <w:t>Фактическая архитектура: React/Vite, Vercel, Supabase, RLS, RPC, /api/analyze-book и смысловой поиск через /api/semantic-search.</w:t>
             </w:r>
           </w:p>
         </w:tc>
@@ -342,17 +333,8 @@
             <w:tcW w:type="dxa" w:w="5128"/>
           </w:tcPr>
           <w:p>
-            <w:pPr>
-              <w:spacing w:after="0"/>
-            </w:pPr>
-            <w:r/>
             <w:r>
-              <w:rPr>
-                <w:rFonts w:ascii="Times New Roman" w:hAnsi="Times New Roman" w:eastAsia="Times New Roman"/>
-                <w:b w:val="0"/>
-                <w:sz w:val="16"/>
-              </w:rPr>
-              <w:t>Спецификация программных интерфейсов и взаимодействия с Supabase; /api/v1 не описывается как реализованный API.</w:t>
+              <w:t>Спецификация программных интерфейсов Supabase, RPC, Vercel Functions, match_books_semantic; /api/v1 не описывается как реализованный API.</w:t>
             </w:r>
           </w:p>
         </w:tc>
@@ -382,17 +364,8 @@
             <w:tcW w:type="dxa" w:w="5128"/>
           </w:tcPr>
           <w:p>
-            <w:pPr>
-              <w:spacing w:after="0"/>
-            </w:pPr>
-            <w:r/>
             <w:r>
-              <w:rPr>
-                <w:rFonts w:ascii="Times New Roman" w:hAnsi="Times New Roman" w:eastAsia="Times New Roman"/>
-                <w:b w:val="0"/>
-                <w:sz w:val="16"/>
-              </w:rPr>
-              <w:t>Таблицы Supabase PostgreSQL, связи, profiles + Supabase Auth, RLS и ИИ-профили.</w:t>
+              <w:t>Таблицы Supabase PostgreSQL, profiles + Supabase Auth, RLS, book_ai_profiles, pgvector и embedding-поля.</w:t>
             </w:r>
           </w:p>
         </w:tc>
@@ -462,17 +435,8 @@
             <w:tcW w:type="dxa" w:w="5128"/>
           </w:tcPr>
           <w:p>
-            <w:pPr>
-              <w:spacing w:after="0"/>
-            </w:pPr>
-            <w:r/>
             <w:r>
-              <w:rPr>
-                <w:rFonts w:ascii="Times New Roman" w:hAnsi="Times New Roman" w:eastAsia="Times New Roman"/>
-                <w:b w:val="0"/>
-                <w:sz w:val="16"/>
-              </w:rPr>
-              <w:t>Проверка UI, Supabase/RLS, RPC, serverless-функции и сборки.</w:t>
+              <w:t>Проверка UI, Supabase/RLS, RPC, serverless-функций, сборки и semantic search.</w:t>
             </w:r>
           </w:p>
         </w:tc>
@@ -502,17 +466,8 @@
             <w:tcW w:type="dxa" w:w="5128"/>
           </w:tcPr>
           <w:p>
-            <w:pPr>
-              <w:spacing w:after="0"/>
-            </w:pPr>
-            <w:r/>
             <w:r>
-              <w:rPr>
-                <w:rFonts w:ascii="Times New Roman" w:hAnsi="Times New Roman" w:eastAsia="Times New Roman"/>
-                <w:b w:val="0"/>
-                <w:sz w:val="16"/>
-              </w:rPr>
-              <w:t>Тест-кейсы для ключевых пользовательских, административных и ИИ-сценариев.</w:t>
+              <w:t>Тест-кейсы для пользовательских, административных, ИИ-сценариев и смыслового поиска.</w:t>
             </w:r>
           </w:p>
         </w:tc>

</xml_diff>